<commit_message>
Non-JD tool docs: leave question and Transfer suggested only (0.5.0); F7 done
Co-Authored-By: Claude Opus 5.5 <noreply@anthropic.com>
</commit_message>
<xml_diff>
--- a/projects/part order tool - app/for-users/Non-JD Order Tool - User Guide.docx
+++ b/projects/part order tool - app/for-users/Non-JD Order Tool - User Guide.docx
@@ -466,7 +466,47 @@
         <w:t xml:space="preserve">Transfer suggested only</w:t>
       </w:r>
       <w:r>
-        <w:t xml:space="preserve"> lists just the parts another branch could send (below). It only shows when there are suggestions.</w:t>
+        <w:t xml:space="preserve"> lists every part another branch could send (below), ordered or not, so redistribution-only parts with an order of 0 show too. While it is on, </w:t>
+      </w:r>
+      <w:r>
+        <w:rPr>
+          <w:b/>
+          <w:bCs/>
+        </w:rPr>
+        <w:t xml:space="preserve">Reorder needed only</w:t>
+      </w:r>
+      <w:r>
+        <w:t xml:space="preserve"> is greyed out. It only shows when there are suggestions.</w:t>
+      </w:r>
+    </w:p>
+    <w:p>
+      <w:pPr>
+        <w:pStyle w:val="ListParagraph"/>
+        <w:numPr>
+          <w:ilvl w:val="0"/>
+          <w:numId w:val="3"/>
+        </w:numPr>
+        <w:spacing w:after="60"/>
+      </w:pPr>
+      <w:r>
+        <w:rPr>
+          <w:b/>
+          <w:bCs/>
+        </w:rPr>
+        <w:t xml:space="preserve">Leaving with ticked parts:</w:t>
+      </w:r>
+      <w:r>
+        <w:t xml:space="preserve"> if you go to another page while parts are ticked, the app asks first ("Leave this page? 2 ticked parts will be lost."). </w:t>
+      </w:r>
+      <w:r>
+        <w:rPr>
+          <w:b/>
+          <w:bCs/>
+        </w:rPr>
+        <w:t xml:space="preserve">Stay</w:t>
+      </w:r>
+      <w:r>
+        <w:t xml:space="preserve"> keeps them. One-Time Order asks the same on its review step.</w:t>
       </w:r>
     </w:p>
     <w:p>

</xml_diff>

<commit_message>
Non-JD tool docs: 0.5.1 Export together (walkthrough + user guide)
Co-Authored-By: Claude Opus 5.5 <noreply@anthropic.com>
</commit_message>
<xml_diff>
--- a/projects/part order tool - app/for-users/Non-JD Order Tool - User Guide.docx
+++ b/projects/part order tool - app/for-users/Non-JD Order Tool - User Guide.docx
@@ -21,7 +21,7 @@
         <w:rPr>
           <w:color w:val="595959"/>
         </w:rPr>
-        <w:t xml:space="preserve">For Ben, Shannon, Barry and Curt · Version 0.5.0 · October 28, 2026 (test version) · https://10.110.100.13:8443</w:t>
+        <w:t xml:space="preserve">For Ben, Shannon, Barry and Curt · Version 0.5.1 · October 28, 2026 (test version) · https://10.110.100.13:8443</w:t>
       </w:r>
     </w:p>
     <w:p>
@@ -46,7 +46,7 @@
         <w:spacing w:after="120"/>
       </w:pPr>
       <w:r>
-        <w:t xml:space="preserve">This guide covers getting in, what each page does, and exactly how every number is worked out. Version 0.5.0 includes Ben’s round 1 answers, several branches and dealer groups at once, </w:t>
+        <w:t xml:space="preserve">This guide covers getting in, what each page does, and exactly how every number is worked out. Version 0.5.1 includes Ben’s round 1 answers, several branches and dealer groups at once, </w:t>
       </w:r>
       <w:r>
         <w:rPr>
@@ -2557,6 +2557,131 @@
       </w:r>
       <w:r>
         <w:t xml:space="preserve">. Description and bin are saved with the order, so a file exported later still matches what was ordered. Tip: open it in Notepad to see it exactly; Excel drops leading zeros from part numbers on screen.</w:t>
+      </w:r>
+    </w:p>
+    <w:p>
+      <w:pPr>
+        <w:keepNext w:val="false"/>
+        <w:spacing w:after="120"/>
+      </w:pPr>
+      <w:r>
+        <w:rPr>
+          <w:b/>
+          <w:bCs/>
+        </w:rPr>
+        <w:t xml:space="preserve">Export together (0.5.1).</w:t>
+      </w:r>
+      <w:r>
+        <w:t xml:space="preserve"> Tick several orders (Draft or Exported; a placed order can’t be ticked) and a panel offers one CSV instead of one per order. After you create orders for several branches, the new orders open already ticked, with </w:t>
+      </w:r>
+      <w:r>
+        <w:rPr>
+          <w:b/>
+          <w:bCs/>
+        </w:rPr>
+        <w:t xml:space="preserve">Download one CSV for all</w:t>
+      </w:r>
+      <w:r>
+        <w:t xml:space="preserve">. Two choices, remembered in your browser:</w:t>
+      </w:r>
+    </w:p>
+    <w:p>
+      <w:pPr>
+        <w:pStyle w:val="ListParagraph"/>
+        <w:numPr>
+          <w:ilvl w:val="0"/>
+          <w:numId w:val="3"/>
+        </w:numPr>
+        <w:spacing w:after="60"/>
+      </w:pPr>
+      <w:r>
+        <w:rPr>
+          <w:b/>
+          <w:bCs/>
+        </w:rPr>
+        <w:t xml:space="preserve">Lines:</w:t>
+      </w:r>
+      <w:r>
+        <w:t xml:space="preserve"> </w:t>
+      </w:r>
+      <w:r>
+        <w:rPr>
+          <w:b/>
+          <w:bCs/>
+        </w:rPr>
+        <w:t xml:space="preserve">One line per branch</w:t>
+      </w:r>
+      <w:r>
+        <w:t xml:space="preserve"> (a Branch column first; every order line as it is) or </w:t>
+      </w:r>
+      <w:r>
+        <w:rPr>
+          <w:b/>
+          <w:bCs/>
+        </w:rPr>
+        <w:t xml:space="preserve">Total per part</w:t>
+      </w:r>
+      <w:r>
+        <w:t xml:space="preserve"> (one line per franchise and part number, quantities and values added up, with a </w:t>
+      </w:r>
+      <w:r>
+        <w:rPr>
+          <w:b/>
+          <w:bCs/>
+        </w:rPr>
+        <w:t xml:space="preserve">Branches</w:t>
+      </w:r>
+      <w:r>
+        <w:t xml:space="preserve"> column such as “1 (4); 92 (2)”). When the branches’ costs differ, Cost is the quantity-weighted average. A part number in two franchises stays two lines.</w:t>
+      </w:r>
+    </w:p>
+    <w:p>
+      <w:pPr>
+        <w:pStyle w:val="ListParagraph"/>
+        <w:numPr>
+          <w:ilvl w:val="0"/>
+          <w:numId w:val="3"/>
+        </w:numPr>
+        <w:spacing w:after="60"/>
+      </w:pPr>
+      <w:r>
+        <w:rPr>
+          <w:b/>
+          <w:bCs/>
+        </w:rPr>
+        <w:t xml:space="preserve">Files:</w:t>
+      </w:r>
+      <w:r>
+        <w:t xml:space="preserve"> </w:t>
+      </w:r>
+      <w:r>
+        <w:rPr>
+          <w:b/>
+          <w:bCs/>
+        </w:rPr>
+        <w:t xml:space="preserve">One file per franchise</w:t>
+      </w:r>
+      <w:r>
+        <w:t xml:space="preserve"> (each goes to its own vendor) or </w:t>
+      </w:r>
+      <w:r>
+        <w:rPr>
+          <w:b/>
+          <w:bCs/>
+        </w:rPr>
+        <w:t xml:space="preserve">One file for everything</w:t>
+      </w:r>
+      <w:r>
+        <w:t xml:space="preserve"> (a Franchise column).</w:t>
+      </w:r>
+    </w:p>
+    <w:p>
+      <w:pPr>
+        <w:keepNext w:val="false"/>
+        <w:spacing w:after="120"/>
+      </w:pPr>
+      <w:r>
+        <w:t xml:space="preserve">Every order in the file counts as exported, exactly as if you had exported it on its own (Exported, export count + 1). The orders themselves stay saved one per branch and franchise.</w:t>
       </w:r>
     </w:p>
     <w:p>
@@ -7086,7 +7211,7 @@
         <w:sz w:val="16"/>
         <w:szCs w:val="16"/>
       </w:rPr>
-      <w:t xml:space="preserve">Non-JD Parts Order Tool: user guide (version 0.5.0)   ·   Page </w:t>
+      <w:t xml:space="preserve">Non-JD Parts Order Tool: user guide (version 0.5.1)   ·   Page </w:t>
     </w:r>
     <w:r>
       <w:rPr>

</xml_diff>

<commit_message>
Non-JD tool 0.5.2: archive orders in the walkthrough and guide; Plan F review fixes
Co-Authored-By: Claude Opus 5.5 <noreply@anthropic.com>
</commit_message>
<xml_diff>
--- a/projects/part order tool - app/for-users/Non-JD Order Tool - User Guide.docx
+++ b/projects/part order tool - app/for-users/Non-JD Order Tool - User Guide.docx
@@ -21,7 +21,7 @@
         <w:rPr>
           <w:color w:val="595959"/>
         </w:rPr>
-        <w:t xml:space="preserve">For Ben, Shannon, Barry and Curt · Version 0.5.1 · October 28, 2026 (test version) · https://10.110.100.13:8443</w:t>
+        <w:t xml:space="preserve">For Ben, Shannon, Barry and Curt · Version 0.5.2 · October 28, 2026 (test version) · https://10.110.100.13:8443</w:t>
       </w:r>
     </w:p>
     <w:p>
@@ -46,7 +46,7 @@
         <w:spacing w:after="120"/>
       </w:pPr>
       <w:r>
-        <w:t xml:space="preserve">This guide covers getting in, what each page does, and exactly how every number is worked out. Version 0.5.1 includes Ben’s round 1 answers, several branches and dealer groups at once, </w:t>
+        <w:t xml:space="preserve">This guide covers getting in, what each page does, and exactly how every number is worked out. Version 0.5.2 includes Ben’s round 1 answers, several branches and dealer groups at once, </w:t>
       </w:r>
       <w:r>
         <w:rPr>
@@ -2572,7 +2572,7 @@
         <w:t xml:space="preserve">Export together (0.5.1).</w:t>
       </w:r>
       <w:r>
-        <w:t xml:space="preserve"> Tick several orders (Draft or Exported; a placed order can’t be ticked) and a panel offers one CSV instead of one per order. After you create orders for several branches, the new orders open already ticked, with </w:t>
+        <w:t xml:space="preserve"> Tick several orders and a panel offers one CSV instead of one per order (only Draft and Exported orders go in; placed and archived ones are left out, and the panel says how many it takes). After you create orders for several branches, the new orders open already ticked, with </w:t>
       </w:r>
       <w:r>
         <w:rPr>
@@ -2682,6 +2682,72 @@
       </w:pPr>
       <w:r>
         <w:t xml:space="preserve">Every order in the file counts as exported, exactly as if you had exported it on its own (Exported, export count + 1). The orders themselves stay saved one per branch and franchise.</w:t>
+      </w:r>
+    </w:p>
+    <w:p>
+      <w:pPr>
+        <w:keepNext w:val="false"/>
+        <w:spacing w:after="120"/>
+      </w:pPr>
+      <w:r>
+        <w:rPr>
+          <w:b/>
+          <w:bCs/>
+        </w:rPr>
+        <w:t xml:space="preserve">Archiving orders (0.5.2).</w:t>
+      </w:r>
+      <w:r>
+        <w:t xml:space="preserve"> Tick orders and click </w:t>
+      </w:r>
+      <w:r>
+        <w:rPr>
+          <w:b/>
+          <w:bCs/>
+        </w:rPr>
+        <w:t xml:space="preserve">Archive (N)</w:t>
+      </w:r>
+      <w:r>
+        <w:t xml:space="preserve">, or use </w:t>
+      </w:r>
+      <w:r>
+        <w:rPr>
+          <w:b/>
+          <w:bCs/>
+        </w:rPr>
+        <w:t xml:space="preserve">Archive</w:t>
+      </w:r>
+      <w:r>
+        <w:t xml:space="preserve"> on an order’s own page, to hide orders you no longer need to see (test orders, orders placed long ago). Nothing is deleted and nothing else changes: status, export count and lines stay as they were. Archived orders are hidden unless </w:t>
+      </w:r>
+      <w:r>
+        <w:rPr>
+          <w:b/>
+          <w:bCs/>
+        </w:rPr>
+        <w:t xml:space="preserve">Show archived</w:t>
+      </w:r>
+      <w:r>
+        <w:t xml:space="preserve"> is on (remembered on your computer), where they show greyed with an </w:t>
+      </w:r>
+      <w:r>
+        <w:rPr>
+          <w:b/>
+          <w:bCs/>
+        </w:rPr>
+        <w:t xml:space="preserve">Archived</w:t>
+      </w:r>
+      <w:r>
+        <w:t xml:space="preserve"> tag. An archived order is read-only until you click </w:t>
+      </w:r>
+      <w:r>
+        <w:rPr>
+          <w:b/>
+          <w:bCs/>
+        </w:rPr>
+        <w:t xml:space="preserve">Unarchive</w:t>
+      </w:r>
+      <w:r>
+        <w:t xml:space="preserve">.</w:t>
       </w:r>
     </w:p>
     <w:p>
@@ -7211,7 +7277,7 @@
         <w:sz w:val="16"/>
         <w:szCs w:val="16"/>
       </w:rPr>
-      <w:t xml:space="preserve">Non-JD Parts Order Tool: user guide (version 0.5.1)   ·   Page </w:t>
+      <w:t xml:space="preserve">Non-JD Parts Order Tool: user guide (version 0.5.2)   ·   Page </w:t>
     </w:r>
     <w:r>
       <w:rPr>

</xml_diff>

<commit_message>
Non-JD tool 0.6.0 docs: walkthrough, guide, rules (Plan F F14)
Co-Authored-By: Claude Opus 5.5 <noreply@anthropic.com>
</commit_message>
<xml_diff>
--- a/projects/part order tool - app/for-users/Non-JD Order Tool - User Guide.docx
+++ b/projects/part order tool - app/for-users/Non-JD Order Tool - User Guide.docx
@@ -21,7 +21,7 @@
         <w:rPr>
           <w:color w:val="595959"/>
         </w:rPr>
-        <w:t xml:space="preserve">For Ben, Shannon, Barry and Curt · Version 0.5.2 · October 28, 2026 (test version) · https://10.110.100.13:8443</w:t>
+        <w:t xml:space="preserve">For Ben, Shannon, Barry and Curt · Version 0.6.0 · October 28, 2026 (test version) · https://10.110.100.13:8443</w:t>
       </w:r>
     </w:p>
     <w:p>
@@ -46,7 +46,7 @@
         <w:spacing w:after="120"/>
       </w:pPr>
       <w:r>
-        <w:t xml:space="preserve">This guide covers getting in, what each page does, and exactly how every number is worked out. Version 0.5.2 includes Ben’s round 1 answers, several branches and dealer groups at once, </w:t>
+        <w:t xml:space="preserve">This guide covers getting in, what each page does, and exactly how every number is worked out. Version 0.6.0 includes Ben’s round 1 answers, several branches and dealer groups at once, </w:t>
       </w:r>
       <w:r>
         <w:rPr>
@@ -56,7 +56,7 @@
         <w:t xml:space="preserve">phase-in</w:t>
       </w:r>
       <w:r>
-        <w:t xml:space="preserve">, and </w:t>
+        <w:t xml:space="preserve">, </w:t>
       </w:r>
       <w:r>
         <w:rPr>
@@ -66,7 +66,17 @@
         <w:t xml:space="preserve">transfer suggestions</w:t>
       </w:r>
       <w:r>
-        <w:t xml:space="preserve"> (round 2, from Ben’s answers of October 27). What changed in each version is in the </w:t>
+        <w:t xml:space="preserve"> and </w:t>
+      </w:r>
+      <w:r>
+        <w:rPr>
+          <w:b/>
+          <w:bCs/>
+        </w:rPr>
+        <w:t xml:space="preserve">saving transfers</w:t>
+      </w:r>
+      <w:r>
+        <w:t xml:space="preserve"> in the app, with transfer orders and transfer rules (round 2, from Ben’s answers of October 27). What changed in each version is in the </w:t>
       </w:r>
       <w:r>
         <w:rPr>
@@ -329,7 +339,17 @@
         <w:t xml:space="preserve">Review transfers</w:t>
       </w:r>
       <w:r>
-        <w:t xml:space="preserve"> opens the Transfers page on the parts coming into your branch. The card is hidden on a morning with no suggestions.</w:t>
+        <w:t xml:space="preserve"> opens Recommended Reorder on </w:t>
+      </w:r>
+      <w:r>
+        <w:rPr>
+          <w:b/>
+          <w:bCs/>
+        </w:rPr>
+        <w:t xml:space="preserve">step 1 (Transfers)</w:t>
+      </w:r>
+      <w:r>
+        <w:t xml:space="preserve"> for your branch, where you tick and save them. The card is hidden on a morning with no suggestions.</w:t>
       </w:r>
     </w:p>
     <w:p>
@@ -748,7 +768,7 @@
         <w:t xml:space="preserve">See Transfers</w:t>
       </w:r>
       <w:r>
-        <w:t xml:space="preserve">, which opens the Transfers page on this branch.</w:t>
+        <w:t xml:space="preserve">.</w:t>
       </w:r>
     </w:p>
     <w:p>
@@ -815,42 +835,6 @@
       </w:r>
       <w:r>
         <w:t xml:space="preserve"> box comes first: for example "Branch 92 can send 1 instead of buying (Conventional), and 9 more (Redistribution)."</w:t>
-      </w:r>
-    </w:p>
-    <w:p>
-      <w:pPr>
-        <w:keepNext w:val="false"/>
-        <w:pBdr>
-          <w:left w:val="single" w:color="1F4E79" w:sz="12" w:space="8"/>
-        </w:pBdr>
-        <w:spacing w:before="60" w:after="160"/>
-        <w:ind w:left="360"/>
-      </w:pPr>
-      <w:r>
-        <w:rPr>
-          <w:i/>
-          <w:iCs/>
-          <w:color w:val="404040"/>
-        </w:rPr>
-        <w:t xml:space="preserve">In this version the suggested </w:t>
-      </w:r>
-      <w:r>
-        <w:rPr>
-          <w:b/>
-          <w:bCs/>
-          <w:i/>
-          <w:iCs/>
-          <w:color w:val="404040"/>
-        </w:rPr>
-        <w:t xml:space="preserve">order doesn’t drop</w:t>
-      </w:r>
-      <w:r>
-        <w:rPr>
-          <w:i/>
-          <w:iCs/>
-          <w:color w:val="404040"/>
-        </w:rPr>
-        <w:t xml:space="preserve"> when a transfer is suggested. Key the transfer into Equip yourself and lower the order before you save it. Ticking and saving transfers in the app comes in the next version, and the order will then be recalculated.</w:t>
       </w:r>
     </w:p>
     <w:p>
@@ -859,17 +843,276 @@
         <w:spacing w:after="120"/>
       </w:pPr>
       <w:r>
-        <w:t xml:space="preserve">These marks are from </w:t>
-      </w:r>
-      <w:r>
-        <w:rPr>
-          <w:b/>
-          <w:bCs/>
-        </w:rPr>
-        <w:t xml:space="preserve">this morning’s</w:t>
-      </w:r>
-      <w:r>
-        <w:t xml:space="preserve"> suggestions. The Transfers page works them out again live.</w:t>
+        <w:t xml:space="preserve">A suggestion alone doesn’t lower the order: the order counts </w:t>
+      </w:r>
+      <w:r>
+        <w:rPr>
+          <w:b/>
+          <w:bCs/>
+        </w:rPr>
+        <w:t xml:space="preserve">saved</w:t>
+      </w:r>
+      <w:r>
+        <w:t xml:space="preserve"> transfers only. Save them on step 1 (below).</w:t>
+      </w:r>
+    </w:p>
+    <w:p>
+      <w:pPr>
+        <w:pStyle w:val="Heading3"/>
+      </w:pPr>
+      <w:r>
+        <w:t xml:space="preserve">Saving transfers: step 1 and step 2</w:t>
+      </w:r>
+    </w:p>
+    <w:p>
+      <w:pPr>
+        <w:keepNext w:val="false"/>
+        <w:spacing w:after="120"/>
+      </w:pPr>
+      <w:r>
+        <w:t xml:space="preserve">When any transfer is suggested into the branches you picked, Recommended Reorder opens on </w:t>
+      </w:r>
+      <w:r>
+        <w:rPr>
+          <w:b/>
+          <w:bCs/>
+        </w:rPr>
+        <w:t xml:space="preserve">step 1</w:t>
+      </w:r>
+      <w:r>
+        <w:t xml:space="preserve"> of </w:t>
+      </w:r>
+      <w:r>
+        <w:rPr>
+          <w:b/>
+          <w:bCs/>
+        </w:rPr>
+        <w:t xml:space="preserve">1 Transfers → 2 Order</w:t>
+      </w:r>
+      <w:r>
+        <w:t xml:space="preserve">; otherwise it opens on step 2 and step 1 says “No transfers suggested”.</w:t>
+      </w:r>
+    </w:p>
+    <w:p>
+      <w:pPr>
+        <w:pStyle w:val="ListParagraph"/>
+        <w:numPr>
+          <w:ilvl w:val="0"/>
+          <w:numId w:val="3"/>
+        </w:numPr>
+        <w:spacing w:after="60"/>
+      </w:pPr>
+      <w:r>
+        <w:rPr>
+          <w:b/>
+          <w:bCs/>
+        </w:rPr>
+        <w:t xml:space="preserve">Step 1</w:t>
+      </w:r>
+      <w:r>
+        <w:t xml:space="preserve"> lists every suggestion into your branches, </w:t>
+      </w:r>
+      <w:r>
+        <w:rPr>
+          <w:b/>
+          <w:bCs/>
+        </w:rPr>
+        <w:t xml:space="preserve">Conventional</w:t>
+      </w:r>
+      <w:r>
+        <w:t xml:space="preserve"> and </w:t>
+      </w:r>
+      <w:r>
+        <w:rPr>
+          <w:b/>
+          <w:bCs/>
+        </w:rPr>
+        <w:t xml:space="preserve">Redistribution</w:t>
+      </w:r>
+      <w:r>
+        <w:t xml:space="preserve">, all ticked to start with, with a franchise filter. Untick what you don’t want, or change a quantity (a whole number, never more than suggested: “At most 44”). The line under the table says what the ticked lines do, for example “2 transfers cover 2 order lines and $38.00 you won’t buy.”</w:t>
+      </w:r>
+    </w:p>
+    <w:p>
+      <w:pPr>
+        <w:pStyle w:val="ListParagraph"/>
+        <w:numPr>
+          <w:ilvl w:val="0"/>
+          <w:numId w:val="3"/>
+        </w:numPr>
+        <w:spacing w:after="60"/>
+      </w:pPr>
+      <w:r>
+        <w:t xml:space="preserve">Every branch loads in the background first. Until then the list is this morning’s, marked “as of this morning”, and can’t be saved (“Loading every branch… you can save once it finishes”), so a save is always checked against live stock.</w:t>
+      </w:r>
+    </w:p>
+    <w:p>
+      <w:pPr>
+        <w:pStyle w:val="ListParagraph"/>
+        <w:numPr>
+          <w:ilvl w:val="0"/>
+          <w:numId w:val="3"/>
+        </w:numPr>
+        <w:spacing w:after="60"/>
+      </w:pPr>
+      <w:r>
+        <w:rPr>
+          <w:b/>
+          <w:bCs/>
+        </w:rPr>
+        <w:t xml:space="preserve">Save N transfers (N transfer orders)</w:t>
+      </w:r>
+      <w:r>
+        <w:t xml:space="preserve"> saves the ticked lines as one </w:t>
+      </w:r>
+      <w:r>
+        <w:rPr>
+          <w:b/>
+          <w:bCs/>
+        </w:rPr>
+        <w:t xml:space="preserve">transfer order</w:t>
+      </w:r>
+      <w:r>
+        <w:t xml:space="preserve"> per sending and receiving branch, all franchises together, and lists them under </w:t>
+      </w:r>
+      <w:r>
+        <w:rPr>
+          <w:b/>
+          <w:bCs/>
+        </w:rPr>
+        <w:t xml:space="preserve">Saved transfers</w:t>
+      </w:r>
+      <w:r>
+        <w:t xml:space="preserve"> with a link to each.</w:t>
+      </w:r>
+    </w:p>
+    <w:p>
+      <w:pPr>
+        <w:pStyle w:val="ListParagraph"/>
+        <w:numPr>
+          <w:ilvl w:val="0"/>
+          <w:numId w:val="3"/>
+        </w:numPr>
+        <w:spacing w:after="60"/>
+      </w:pPr>
+      <w:r>
+        <w:t xml:space="preserve">Just before saving, the app checks each sending branch still has the stock. If someone else took it meanwhile, </w:t>
+      </w:r>
+      <w:r>
+        <w:rPr>
+          <w:b/>
+          <w:bCs/>
+        </w:rPr>
+        <w:t xml:space="preserve">nothing is saved</w:t>
+      </w:r>
+      <w:r>
+        <w:t xml:space="preserve">: a banner lists what changed (for example “… from 92 to 1: 9 → 4 (branch 92 now has only 4 to send)” or “no longer suggested”), the ticks are adjusted, and you click Save again.</w:t>
+      </w:r>
+    </w:p>
+    <w:p>
+      <w:pPr>
+        <w:pStyle w:val="ListParagraph"/>
+        <w:numPr>
+          <w:ilvl w:val="0"/>
+          <w:numId w:val="3"/>
+        </w:numPr>
+        <w:spacing w:after="60"/>
+      </w:pPr>
+      <w:r>
+        <w:t xml:space="preserve">If SharePoint is slow to show what you saved: “Saved. The list hasn’t caught up yet — Refresh in a moment.” The order already counts it. </w:t>
+      </w:r>
+      <w:r>
+        <w:rPr>
+          <w:b/>
+          <w:bCs/>
+        </w:rPr>
+        <w:t xml:space="preserve">Refresh</w:t>
+      </w:r>
+      <w:r>
+        <w:t xml:space="preserve"> re-reads the saved transfers at any time.</w:t>
+      </w:r>
+    </w:p>
+    <w:p>
+      <w:pPr>
+        <w:pStyle w:val="ListParagraph"/>
+        <w:numPr>
+          <w:ilvl w:val="0"/>
+          <w:numId w:val="3"/>
+        </w:numPr>
+        <w:spacing w:after="60"/>
+      </w:pPr>
+      <w:r>
+        <w:rPr>
+          <w:b/>
+          <w:bCs/>
+        </w:rPr>
+        <w:t xml:space="preserve">Continue to order ›</w:t>
+      </w:r>
+      <w:r>
+        <w:t xml:space="preserve"> goes to step 2. With unsaved ticks it asks “Save the N ticked transfers first?”: </w:t>
+      </w:r>
+      <w:r>
+        <w:rPr>
+          <w:b/>
+          <w:bCs/>
+        </w:rPr>
+        <w:t xml:space="preserve">Save and continue</w:t>
+      </w:r>
+      <w:r>
+        <w:t xml:space="preserve"> or </w:t>
+      </w:r>
+      <w:r>
+        <w:rPr>
+          <w:b/>
+          <w:bCs/>
+        </w:rPr>
+        <w:t xml:space="preserve">Continue without them</w:t>
+      </w:r>
+      <w:r>
+        <w:t xml:space="preserve">. The order only ever counts saved transfers.</w:t>
+      </w:r>
+    </w:p>
+    <w:p>
+      <w:pPr>
+        <w:pStyle w:val="ListParagraph"/>
+        <w:numPr>
+          <w:ilvl w:val="0"/>
+          <w:numId w:val="3"/>
+        </w:numPr>
+        <w:spacing w:after="60"/>
+      </w:pPr>
+      <w:r>
+        <w:rPr>
+          <w:b/>
+          <w:bCs/>
+        </w:rPr>
+        <w:t xml:space="preserve">Step 2</w:t>
+      </w:r>
+      <w:r>
+        <w:t xml:space="preserve"> is the order list. A line a saved transfer reduced shows </w:t>
+      </w:r>
+      <w:r>
+        <w:rPr>
+          <w:b/>
+          <w:bCs/>
+        </w:rPr>
+        <w:t xml:space="preserve">Transfer in: 44 from branch 6</w:t>
+      </w:r>
+      <w:r>
+        <w:t xml:space="preserve">; a line it covered fully has nothing left to order and leaves “Reorder needed only”.</w:t>
+      </w:r>
+    </w:p>
+    <w:p>
+      <w:pPr>
+        <w:pStyle w:val="ListParagraph"/>
+        <w:numPr>
+          <w:ilvl w:val="0"/>
+          <w:numId w:val="3"/>
+        </w:numPr>
+        <w:spacing w:after="60"/>
+      </w:pPr>
+      <w:r>
+        <w:t xml:space="preserve">Leaving the page with unsaved transfer changes or ticked parts asks first.</w:t>
       </w:r>
     </w:p>
     <w:p>
@@ -2007,17 +2250,27 @@
         <w:spacing w:after="120"/>
       </w:pPr>
       <w:r>
-        <w:t xml:space="preserve">Every suggested transfer between branches, all branches and franchises together. Read only in this version: </w:t>
-      </w:r>
-      <w:r>
-        <w:rPr>
-          <w:b/>
-          <w:bCs/>
-        </w:rPr>
-        <w:t xml:space="preserve">key them into Equip by hand</w:t>
-      </w:r>
-      <w:r>
-        <w:t xml:space="preserve">. Saving transfers comes next.</w:t>
+        <w:t xml:space="preserve">Every suggested transfer between branches, all branches and franchises together, in two tabs: </w:t>
+      </w:r>
+      <w:r>
+        <w:rPr>
+          <w:b/>
+          <w:bCs/>
+        </w:rPr>
+        <w:t xml:space="preserve">Suggestions</w:t>
+      </w:r>
+      <w:r>
+        <w:t xml:space="preserve"> and </w:t>
+      </w:r>
+      <w:r>
+        <w:rPr>
+          <w:b/>
+          <w:bCs/>
+        </w:rPr>
+        <w:t xml:space="preserve">Transfer orders</w:t>
+      </w:r>
+      <w:r>
+        <w:t xml:space="preserve">.</w:t>
       </w:r>
     </w:p>
     <w:p>
@@ -2123,6 +2376,16 @@
         <w:t xml:space="preserve">From</w:t>
       </w:r>
       <w:r>
+        <w:t xml:space="preserve">, </w:t>
+      </w:r>
+      <w:r>
+        <w:rPr>
+          <w:b/>
+          <w:bCs/>
+        </w:rPr>
+        <w:t xml:space="preserve">To</w:t>
+      </w:r>
+      <w:r>
         <w:t xml:space="preserve"> and </w:t>
       </w:r>
       <w:r>
@@ -2130,10 +2393,60 @@
           <w:b/>
           <w:bCs/>
         </w:rPr>
-        <w:t xml:space="preserve">To</w:t>
-      </w:r>
-      <w:r>
-        <w:t xml:space="preserve"> branch.</w:t>
+        <w:t xml:space="preserve">Status</w:t>
+      </w:r>
+      <w:r>
+        <w:t xml:space="preserve">: </w:t>
+      </w:r>
+      <w:r>
+        <w:rPr>
+          <w:b/>
+          <w:bCs/>
+        </w:rPr>
+        <w:t xml:space="preserve">Suggested</w:t>
+      </w:r>
+      <w:r>
+        <w:t xml:space="preserve">, or </w:t>
+      </w:r>
+      <w:r>
+        <w:rPr>
+          <w:b/>
+          <w:bCs/>
+        </w:rPr>
+        <w:t xml:space="preserve">Saved today</w:t>
+      </w:r>
+      <w:r>
+        <w:t xml:space="preserve"> (today’s saved transfer lines).</w:t>
+      </w:r>
+    </w:p>
+    <w:p>
+      <w:pPr>
+        <w:pStyle w:val="ListParagraph"/>
+        <w:numPr>
+          <w:ilvl w:val="0"/>
+          <w:numId w:val="3"/>
+        </w:numPr>
+        <w:spacing w:after="60"/>
+      </w:pPr>
+      <w:r>
+        <w:rPr>
+          <w:b/>
+          <w:bCs/>
+        </w:rPr>
+        <w:t xml:space="preserve">Tick and save</w:t>
+      </w:r>
+      <w:r>
+        <w:t xml:space="preserve"> as on Reorder step 1. Save takes only the ticked lines </w:t>
+      </w:r>
+      <w:r>
+        <w:rPr>
+          <w:b/>
+          <w:bCs/>
+        </w:rPr>
+        <w:t xml:space="preserve">you can see</w:t>
+      </w:r>
+      <w:r>
+        <w:t xml:space="preserve"> with the current filters, so you can work one sending branch at a time. When ticked lines are further down: “N more ticked lines below — Show more to include them”.</w:t>
       </w:r>
     </w:p>
     <w:p>
@@ -2243,7 +2556,197 @@
         <w:t xml:space="preserve">Transfer rules in use</w:t>
       </w:r>
       <w:r>
-        <w:t xml:space="preserve"> (at the bottom, closed to start with) lists the transfer rules, or the built-in default: excess above 12 months, receive up to 6 months, no minimum.</w:t>
+        <w:t xml:space="preserve"> (at the bottom, closed to start with) lists the transfer rules, or the built-in default, with a link to the Transfer rules page.</w:t>
+      </w:r>
+    </w:p>
+    <w:p>
+      <w:pPr>
+        <w:pStyle w:val="Heading3"/>
+      </w:pPr>
+      <w:r>
+        <w:t xml:space="preserve">Transfer orders</w:t>
+      </w:r>
+    </w:p>
+    <w:p>
+      <w:pPr>
+        <w:keepNext w:val="false"/>
+        <w:spacing w:after="120"/>
+      </w:pPr>
+      <w:r>
+        <w:t xml:space="preserve">The </w:t>
+      </w:r>
+      <w:r>
+        <w:rPr>
+          <w:b/>
+          <w:bCs/>
+        </w:rPr>
+        <w:t xml:space="preserve">Transfer orders</w:t>
+      </w:r>
+      <w:r>
+        <w:t xml:space="preserve"> tab lists every saved transfer, newest first: From, To, status, lines, value at the sending branch’s cost, export count and who saved it when. Filter by From, To and status. A Draft more than a week old shows </w:t>
+      </w:r>
+      <w:r>
+        <w:rPr>
+          <w:b/>
+          <w:bCs/>
+        </w:rPr>
+        <w:t xml:space="preserve">Draft for N days</w:t>
+      </w:r>
+      <w:r>
+        <w:t xml:space="preserve">, and the tab label counts them, so nothing is forgotten.</w:t>
+      </w:r>
+    </w:p>
+    <w:p>
+      <w:pPr>
+        <w:keepNext w:val="false"/>
+        <w:spacing w:after="120"/>
+      </w:pPr>
+      <w:r>
+        <w:t xml:space="preserve">Open one to see its lines. A transfer order goes </w:t>
+      </w:r>
+      <w:r>
+        <w:rPr>
+          <w:b/>
+          <w:bCs/>
+        </w:rPr>
+        <w:t xml:space="preserve">Draft → Exported → Entered in Equip</w:t>
+      </w:r>
+      <w:r>
+        <w:t xml:space="preserve">:</w:t>
+      </w:r>
+    </w:p>
+    <w:p>
+      <w:pPr>
+        <w:pStyle w:val="ListParagraph"/>
+        <w:numPr>
+          <w:ilvl w:val="0"/>
+          <w:numId w:val="3"/>
+        </w:numPr>
+        <w:spacing w:after="60"/>
+      </w:pPr>
+      <w:r>
+        <w:rPr>
+          <w:b/>
+          <w:bCs/>
+        </w:rPr>
+        <w:t xml:space="preserve">Draft:</w:t>
+      </w:r>
+      <w:r>
+        <w:t xml:space="preserve"> change a quantity (never above the suggested quantity; 0 means “Not sent”; lines are never deleted).</w:t>
+      </w:r>
+    </w:p>
+    <w:p>
+      <w:pPr>
+        <w:pStyle w:val="ListParagraph"/>
+        <w:numPr>
+          <w:ilvl w:val="0"/>
+          <w:numId w:val="3"/>
+        </w:numPr>
+        <w:spacing w:after="60"/>
+      </w:pPr>
+      <w:r>
+        <w:rPr>
+          <w:b/>
+          <w:bCs/>
+        </w:rPr>
+        <w:t xml:space="preserve">Export CSV</w:t>
+      </w:r>
+      <w:r>
+        <w:t xml:space="preserve"> downloads </w:t>
+      </w:r>
+      <w:r>
+        <w:rPr>
+          <w:rFonts w:ascii="Consolas" w:cs="Consolas" w:eastAsia="Consolas" w:hAnsi="Consolas"/>
+          <w:sz w:val="20"/>
+          <w:szCs w:val="20"/>
+        </w:rPr>
+        <w:t xml:space="preserve">PartNumber, Franchise, Description, Qty, FromBin, ToBin, Cost, LineValue</w:t>
+      </w:r>
+      <w:r>
+        <w:t xml:space="preserve"> for keying into Equip, and marks it Exported. After that its quantities can’t change; start a new transfer instead.</w:t>
+      </w:r>
+    </w:p>
+    <w:p>
+      <w:pPr>
+        <w:pStyle w:val="ListParagraph"/>
+        <w:numPr>
+          <w:ilvl w:val="0"/>
+          <w:numId w:val="3"/>
+        </w:numPr>
+        <w:spacing w:after="60"/>
+      </w:pPr>
+      <w:r>
+        <w:rPr>
+          <w:b/>
+          <w:bCs/>
+        </w:rPr>
+        <w:t xml:space="preserve">Mark entered in Equip</w:t>
+      </w:r>
+      <w:r>
+        <w:t xml:space="preserve"> once it is keyed in. It needs an export first, because the CSV is the record of what was keyed.</w:t>
+      </w:r>
+    </w:p>
+    <w:p>
+      <w:pPr>
+        <w:pStyle w:val="ListParagraph"/>
+        <w:numPr>
+          <w:ilvl w:val="0"/>
+          <w:numId w:val="3"/>
+        </w:numPr>
+        <w:spacing w:after="60"/>
+      </w:pPr>
+      <w:r>
+        <w:rPr>
+          <w:b/>
+          <w:bCs/>
+        </w:rPr>
+        <w:t xml:space="preserve">Cancel</w:t>
+      </w:r>
+      <w:r>
+        <w:t xml:space="preserve"> (Draft or Exported only) releases the stock for other suggestions. Nothing is deleted.</w:t>
+      </w:r>
+    </w:p>
+    <w:p>
+      <w:pPr>
+        <w:pStyle w:val="ListParagraph"/>
+        <w:numPr>
+          <w:ilvl w:val="0"/>
+          <w:numId w:val="3"/>
+        </w:numPr>
+        <w:spacing w:after="60"/>
+      </w:pPr>
+      <w:r>
+        <w:rPr>
+          <w:b/>
+          <w:bCs/>
+        </w:rPr>
+        <w:t xml:space="preserve">Archive</w:t>
+      </w:r>
+      <w:r>
+        <w:t xml:space="preserve"> hides an entered or cancelled transfer from the list (</w:t>
+      </w:r>
+      <w:r>
+        <w:rPr>
+          <w:b/>
+          <w:bCs/>
+        </w:rPr>
+        <w:t xml:space="preserve">Show archived</w:t>
+      </w:r>
+      <w:r>
+        <w:t xml:space="preserve"> brings it back). An archived transfer is read-only until unarchived.</w:t>
+      </w:r>
+    </w:p>
+    <w:p>
+      <w:pPr>
+        <w:pStyle w:val="ListParagraph"/>
+        <w:numPr>
+          <w:ilvl w:val="0"/>
+          <w:numId w:val="3"/>
+        </w:numPr>
+        <w:spacing w:after="60"/>
+      </w:pPr>
+      <w:r>
+        <w:t xml:space="preserve">If someone else exported, entered, cancelled or archived it while you had it open, your change is refused with a message saying so, and the page shows the current state.</w:t>
       </w:r>
     </w:p>
     <w:p>
@@ -3003,6 +3506,159 @@
       </w:r>
       <w:r>
         <w:t xml:space="preserve"> brings one back.</w:t>
+      </w:r>
+    </w:p>
+    <w:p>
+      <w:pPr>
+        <w:pStyle w:val="Heading2"/>
+      </w:pPr>
+      <w:r>
+        <w:t xml:space="preserve">Transfer rules</w:t>
+      </w:r>
+    </w:p>
+    <w:p>
+      <w:pPr>
+        <w:keepNext w:val="false"/>
+        <w:spacing w:after="120"/>
+      </w:pPr>
+      <w:r>
+        <w:t xml:space="preserve">The rules that decide how much a branch keeps before stock counts as excess, whether it may send or receive, and how much redistribution it takes (section 5). It works like Rules: a list with each rule’s state (</w:t>
+      </w:r>
+      <w:r>
+        <w:rPr>
+          <w:b/>
+          <w:bCs/>
+        </w:rPr>
+        <w:t xml:space="preserve">Active</w:t>
+      </w:r>
+      <w:r>
+        <w:t xml:space="preserve">, </w:t>
+      </w:r>
+      <w:r>
+        <w:rPr>
+          <w:b/>
+          <w:bCs/>
+        </w:rPr>
+        <w:t xml:space="preserve">Off</w:t>
+      </w:r>
+      <w:r>
+        <w:t xml:space="preserve">, </w:t>
+      </w:r>
+      <w:r>
+        <w:rPr>
+          <w:b/>
+          <w:bCs/>
+        </w:rPr>
+        <w:t xml:space="preserve">Out of season</w:t>
+      </w:r>
+      <w:r>
+        <w:t xml:space="preserve">, </w:t>
+      </w:r>
+      <w:r>
+        <w:rPr>
+          <w:b/>
+          <w:bCs/>
+        </w:rPr>
+        <w:t xml:space="preserve">Archived</w:t>
+      </w:r>
+      <w:r>
+        <w:t xml:space="preserve">, or </w:t>
+      </w:r>
+      <w:r>
+        <w:rPr>
+          <w:b/>
+          <w:bCs/>
+        </w:rPr>
+        <w:t xml:space="preserve">Invalid</w:t>
+      </w:r>
+      <w:r>
+        <w:t xml:space="preserve"> with the reason, which means it is skipped), an editor, </w:t>
+      </w:r>
+      <w:r>
+        <w:rPr>
+          <w:b/>
+          <w:bCs/>
+        </w:rPr>
+        <w:t xml:space="preserve">Archive</w:t>
+      </w:r>
+      <w:r>
+        <w:t xml:space="preserve"> instead of delete, and </w:t>
+      </w:r>
+      <w:r>
+        <w:rPr>
+          <w:b/>
+          <w:bCs/>
+        </w:rPr>
+        <w:t xml:space="preserve">Try it</w:t>
+      </w:r>
+      <w:r>
+        <w:t xml:space="preserve">.</w:t>
+      </w:r>
+    </w:p>
+    <w:p>
+      <w:pPr>
+        <w:pStyle w:val="ListParagraph"/>
+        <w:numPr>
+          <w:ilvl w:val="0"/>
+          <w:numId w:val="3"/>
+        </w:numPr>
+        <w:spacing w:after="60"/>
+      </w:pPr>
+      <w:r>
+        <w:t xml:space="preserve">The first row is the read-only </w:t>
+      </w:r>
+      <w:r>
+        <w:rPr>
+          <w:b/>
+          <w:bCs/>
+        </w:rPr>
+        <w:t xml:space="preserve">Built-in default</w:t>
+      </w:r>
+      <w:r>
+        <w:t xml:space="preserve">: excess above 12 months, receive up to 6 months, no minimum for redistribution. It applies wherever no rule matches.</w:t>
+      </w:r>
+    </w:p>
+    <w:p>
+      <w:pPr>
+        <w:pStyle w:val="ListParagraph"/>
+        <w:numPr>
+          <w:ilvl w:val="0"/>
+          <w:numId w:val="3"/>
+        </w:numPr>
+        <w:spacing w:after="60"/>
+      </w:pPr>
+      <w:r>
+        <w:rPr>
+          <w:b/>
+          <w:bCs/>
+        </w:rPr>
+        <w:t xml:space="preserve">Try it</w:t>
+      </w:r>
+      <w:r>
+        <w:t xml:space="preserve"> shows, while you edit, the effect on every branch before you save: conventional lines and </w:t>
+      </w:r>
+      <w:r>
+        <w:rPr>
+          <w:b/>
+          <w:bCs/>
+        </w:rPr>
+        <w:t xml:space="preserve">Order $ avoided</w:t>
+      </w:r>
+      <w:r>
+        <w:t xml:space="preserve">, redistribution lines and dollars, before → after, and the parts that change most. Nothing is saved until you click Save. A rule with a problem shows the problem instead.</w:t>
+      </w:r>
+    </w:p>
+    <w:p>
+      <w:pPr>
+        <w:pStyle w:val="ListParagraph"/>
+        <w:numPr>
+          <w:ilvl w:val="0"/>
+          <w:numId w:val="3"/>
+        </w:numPr>
+        <w:spacing w:after="60"/>
+      </w:pPr>
+      <w:r>
+        <w:t xml:space="preserve">Saving applies straight away in the app; the morning run uses it the next day. Switching on a rule that has problems asks first, because it would be skipped.</w:t>
       </w:r>
     </w:p>
     <w:p>
@@ -6556,27 +7212,84 @@
         <w:spacing w:after="120"/>
       </w:pPr>
       <w:r>
-        <w:t xml:space="preserve">In this version transfer rules are edited by Brian or Ben in the SharePoint list </w:t>
-      </w:r>
-      <w:r>
-        <w:rPr>
-          <w:b/>
-          <w:bCs/>
-        </w:rPr>
-        <w:t xml:space="preserve">NonJD_TransferRules</w:t>
-      </w:r>
-      <w:r>
-        <w:t xml:space="preserve">; a page in the app comes with saving transfers. A rule with a missing or out-of-range setting is skipped: the Transfers page shows it as </w:t>
-      </w:r>
-      <w:r>
-        <w:rPr>
-          <w:b/>
-          <w:bCs/>
-        </w:rPr>
-        <w:t xml:space="preserve">Skipped</w:t>
+        <w:t xml:space="preserve">Transfer rules are edited on the </w:t>
+      </w:r>
+      <w:r>
+        <w:rPr>
+          <w:b/>
+          <w:bCs/>
+        </w:rPr>
+        <w:t xml:space="preserve">Transfer rules</w:t>
+      </w:r>
+      <w:r>
+        <w:t xml:space="preserve"> page (section 2). A rule with a missing or out-of-range setting is skipped: the page shows it as </w:t>
+      </w:r>
+      <w:r>
+        <w:rPr>
+          <w:b/>
+          <w:bCs/>
+        </w:rPr>
+        <w:t xml:space="preserve">Invalid</w:t>
       </w:r>
       <w:r>
         <w:t xml:space="preserve"> with the reason, and Brian’s morning email names it.</w:t>
+      </w:r>
+    </w:p>
+    <w:p>
+      <w:pPr>
+        <w:pStyle w:val="Heading3"/>
+      </w:pPr>
+      <w:r>
+        <w:t xml:space="preserve">Saved transfers</w:t>
+      </w:r>
+    </w:p>
+    <w:p>
+      <w:pPr>
+        <w:keepNext w:val="false"/>
+        <w:spacing w:after="120"/>
+      </w:pPr>
+      <w:r>
+        <w:t xml:space="preserve">A saved transfer counts as stock on its way: it lowers the receiving branch’s order (transfers in) and the sending branch’s excess (transfers out), straight away in the app and in the next morning’s run. A </w:t>
+      </w:r>
+      <w:r>
+        <w:rPr>
+          <w:b/>
+          <w:bCs/>
+        </w:rPr>
+        <w:t xml:space="preserve">Draft</w:t>
+      </w:r>
+      <w:r>
+        <w:t xml:space="preserve"> or </w:t>
+      </w:r>
+      <w:r>
+        <w:rPr>
+          <w:b/>
+          <w:bCs/>
+        </w:rPr>
+        <w:t xml:space="preserve">Exported</w:t>
+      </w:r>
+      <w:r>
+        <w:t xml:space="preserve"> transfer counts until it is entered or cancelled. One </w:t>
+      </w:r>
+      <w:r>
+        <w:rPr>
+          <w:b/>
+          <w:bCs/>
+        </w:rPr>
+        <w:t xml:space="preserve">entered in Equip</w:t>
+      </w:r>
+      <w:r>
+        <w:t xml:space="preserve"> counts until the next morning’s run, when Equip itself shows it. A </w:t>
+      </w:r>
+      <w:r>
+        <w:rPr>
+          <w:b/>
+          <w:bCs/>
+        </w:rPr>
+        <w:t xml:space="preserve">cancelled</w:t>
+      </w:r>
+      <w:r>
+        <w:t xml:space="preserve"> transfer never counts. Archiving changes nothing.</w:t>
       </w:r>
     </w:p>
     <w:p>
@@ -7277,7 +7990,7 @@
         <w:sz w:val="16"/>
         <w:szCs w:val="16"/>
       </w:rPr>
-      <w:t xml:space="preserve">Non-JD Parts Order Tool: user guide (version 0.5.2)   ·   Page </w:t>
+      <w:t xml:space="preserve">Non-JD Parts Order Tool: user guide (version 0.6.0)   ·   Page </w:t>
     </w:r>
     <w:r>
       <w:rPr>

</xml_diff>

<commit_message>
Non-JD docs: 0.6.0 wording (Includes N coming by transfer, singular question, Saved today cancelled note, stale banner)
Co-Authored-By: Claude Opus 5.5 <noreply@anthropic.com>
</commit_message>
<xml_diff>
--- a/projects/part order tool - app/for-users/Non-JD Order Tool - User Guide.docx
+++ b/projects/part order tool - app/for-users/Non-JD Order Tool - User Guide.docx
@@ -639,7 +639,7 @@
         <w:t xml:space="preserve">app</w:t>
       </w:r>
       <w:r>
-        <w:t xml:space="preserve"> tag; hover over the number to see the split).</w:t>
+        <w:t xml:space="preserve"> tag; hover over the number: “Equip transfers + transfers saved in this app”, with the split).</w:t>
       </w:r>
     </w:p>
     <w:p>
@@ -1069,7 +1069,7 @@
         <w:t xml:space="preserve">Continue without them</w:t>
       </w:r>
       <w:r>
-        <w:t xml:space="preserve">. The order only ever counts saved transfers.</w:t>
+        <w:t xml:space="preserve">. The order only ever counts saved transfers. If someone else used the stock after you ticked, nothing is saved: a banner lists what changed, with “Check the changes below and save again.”</w:t>
       </w:r>
     </w:p>
     <w:p>
@@ -1089,17 +1089,17 @@
         <w:t xml:space="preserve">Step 2</w:t>
       </w:r>
       <w:r>
-        <w:t xml:space="preserve"> is the order list. A line a saved transfer reduced shows </w:t>
-      </w:r>
-      <w:r>
-        <w:rPr>
-          <w:b/>
-          <w:bCs/>
-        </w:rPr>
-        <w:t xml:space="preserve">Transfer in: 44 from branch 6</w:t>
-      </w:r>
-      <w:r>
-        <w:t xml:space="preserve">; a line it covered fully has nothing left to order and leaves “Reorder needed only”.</w:t>
+        <w:t xml:space="preserve"> is the order list. A line a saved transfer reduced says </w:t>
+      </w:r>
+      <w:r>
+        <w:rPr>
+          <w:b/>
+          <w:bCs/>
+        </w:rPr>
+        <w:t xml:space="preserve">Includes 44 coming by transfer from branch 6</w:t>
+      </w:r>
+      <w:r>
+        <w:t xml:space="preserve">: that quantity is part of Inbound, not extra; a line it covered fully has nothing left to order and leaves “Reorder needed only”.</w:t>
       </w:r>
     </w:p>
     <w:p>
@@ -2416,7 +2416,37 @@
         <w:t xml:space="preserve">Saved today</w:t>
       </w:r>
       <w:r>
-        <w:t xml:space="preserve"> (today’s saved transfer lines).</w:t>
+        <w:t xml:space="preserve"> (today’s saved transfer lines; cancelled transfers aren’t listed there: see </w:t>
+      </w:r>
+      <w:r>
+        <w:rPr>
+          <w:b/>
+          <w:bCs/>
+        </w:rPr>
+        <w:t xml:space="preserve">Transfer orders</w:t>
+      </w:r>
+      <w:r>
+        <w:t xml:space="preserve"> with Status </w:t>
+      </w:r>
+      <w:r>
+        <w:rPr>
+          <w:b/>
+          <w:bCs/>
+        </w:rPr>
+        <w:t xml:space="preserve">Cancelled</w:t>
+      </w:r>
+      <w:r>
+        <w:t xml:space="preserve">). Statuses read </w:t>
+      </w:r>
+      <w:r>
+        <w:rPr>
+          <w:b/>
+          <w:bCs/>
+        </w:rPr>
+        <w:t xml:space="preserve">Entered in Equip</w:t>
+      </w:r>
+      <w:r>
+        <w:t xml:space="preserve"> for a transfer keyed into Equip.</w:t>
       </w:r>
     </w:p>
     <w:p>
@@ -4029,7 +4059,7 @@
         <w:t xml:space="preserve">transfers in</w:t>
       </w:r>
       <w:r>
-        <w:t xml:space="preserve"> (transfers saved in this app, coming next version), never below 0. On hand and on order count whole units. </w:t>
+        <w:t xml:space="preserve"> (transfers saved in this app), never below 0. On hand and on order count whole units. </w:t>
       </w:r>
       <w:r>
         <w:rPr>

</xml_diff>

<commit_message>
Non-JD docs: 0.6.1/0.6.2 (step 1 search, sticky footer Save, status pills, Transfer orders first, qty cap kept)
Co-Authored-By: Claude Opus 5.5 <noreply@anthropic.com>
</commit_message>
<xml_diff>
--- a/projects/part order tool - app/for-users/Non-JD Order Tool - User Guide.docx
+++ b/projects/part order tool - app/for-users/Non-JD Order Tool - User Guide.docx
@@ -21,7 +21,7 @@
         <w:rPr>
           <w:color w:val="595959"/>
         </w:rPr>
-        <w:t xml:space="preserve">For Ben, Shannon, Barry and Curt · Version 0.6.0 · October 28, 2026 (test version) · https://10.110.100.13:8443</w:t>
+        <w:t xml:space="preserve">For Ben, Shannon, Barry and Curt · Version 0.6.2 · October 29, 2026 (test version) · https://10.110.100.13:8443</w:t>
       </w:r>
     </w:p>
     <w:p>
@@ -46,7 +46,7 @@
         <w:spacing w:after="120"/>
       </w:pPr>
       <w:r>
-        <w:t xml:space="preserve">This guide covers getting in, what each page does, and exactly how every number is worked out. Version 0.6.0 includes Ben’s round 1 answers, several branches and dealer groups at once, </w:t>
+        <w:t xml:space="preserve">This guide covers getting in, what each page does, and exactly how every number is worked out. Version 0.6.2 includes Ben’s round 1 answers, several branches and dealer groups at once, </w:t>
       </w:r>
       <w:r>
         <w:rPr>
@@ -930,7 +930,37 @@
         <w:t xml:space="preserve">Redistribution</w:t>
       </w:r>
       <w:r>
-        <w:t xml:space="preserve">, all ticked to start with, with a franchise filter. Untick what you don’t want, or change a quantity (a whole number, never more than suggested: “At most 44”). The line under the table says what the ticked lines do, for example “2 transfers cover 2 order lines and $38.00 you won’t buy.”</w:t>
+        <w:t xml:space="preserve">, all ticked to start with, with a franchise filter. Untick what you don’t want, or change a quantity (a whole number, never more than suggested: “At most 44”). The footer under the list says what the ticked lines do, for example “2 transfers cover 2 order lines and $38.00 you won’t buy.” It stays at the bottom of the window while you scroll, with its own </w:t>
+      </w:r>
+      <w:r>
+        <w:rPr>
+          <w:b/>
+          <w:bCs/>
+        </w:rPr>
+        <w:t xml:space="preserve">Save</w:t>
+      </w:r>
+      <w:r>
+        <w:t xml:space="preserve"> button.</w:t>
+      </w:r>
+    </w:p>
+    <w:p>
+      <w:pPr>
+        <w:pStyle w:val="ListParagraph"/>
+        <w:numPr>
+          <w:ilvl w:val="0"/>
+          <w:numId w:val="3"/>
+        </w:numPr>
+        <w:spacing w:after="60"/>
+      </w:pPr>
+      <w:r>
+        <w:rPr>
+          <w:b/>
+          <w:bCs/>
+        </w:rPr>
+        <w:t xml:space="preserve">Search:</w:t>
+      </w:r>
+      <w:r>
+        <w:t xml:space="preserve"> the part search box at the top of the page also filters step 1’s list, by part number or description. It doesn’t change what is ticked, and Save still saves every ticked line. When the search hides ticked lines, the footer says so: “3 of 10 ticked lines shown”.</w:t>
       </w:r>
     </w:p>
     <w:p>
@@ -2250,7 +2280,17 @@
         <w:spacing w:after="120"/>
       </w:pPr>
       <w:r>
-        <w:t xml:space="preserve">Every suggested transfer between branches, all branches and franchises together, in two tabs: </w:t>
+        <w:t xml:space="preserve">Saved transfers and every suggested transfer between branches, all branches and franchises together, in two tabs: </w:t>
+      </w:r>
+      <w:r>
+        <w:rPr>
+          <w:b/>
+          <w:bCs/>
+        </w:rPr>
+        <w:t xml:space="preserve">Transfer orders</w:t>
+      </w:r>
+      <w:r>
+        <w:t xml:space="preserve"> (first) and </w:t>
       </w:r>
       <w:r>
         <w:rPr>
@@ -2260,7 +2300,17 @@
         <w:t xml:space="preserve">Suggestions</w:t>
       </w:r>
       <w:r>
-        <w:t xml:space="preserve"> and </w:t>
+        <w:t xml:space="preserve">. </w:t>
+      </w:r>
+      <w:r>
+        <w:rPr>
+          <w:b/>
+          <w:bCs/>
+        </w:rPr>
+        <w:t xml:space="preserve">Transfers</w:t>
+      </w:r>
+      <w:r>
+        <w:t xml:space="preserve"> in the menu opens on </w:t>
       </w:r>
       <w:r>
         <w:rPr>
@@ -2270,7 +2320,46 @@
         <w:t xml:space="preserve">Transfer orders</w:t>
       </w:r>
       <w:r>
-        <w:t xml:space="preserve">.</w:t>
+        <w:t xml:space="preserve"> (below). Home’s </w:t>
+      </w:r>
+      <w:r>
+        <w:rPr>
+          <w:b/>
+          <w:bCs/>
+        </w:rPr>
+        <w:t xml:space="preserve">Review transfers</w:t>
+      </w:r>
+      <w:r>
+        <w:t xml:space="preserve"> and the links on Recommended Reorder (</w:t>
+      </w:r>
+      <w:r>
+        <w:rPr>
+          <w:b/>
+          <w:bCs/>
+        </w:rPr>
+        <w:t xml:space="preserve">See Transfers</w:t>
+      </w:r>
+      <w:r>
+        <w:t xml:space="preserve">) go to the suggestions.</w:t>
+      </w:r>
+    </w:p>
+    <w:p>
+      <w:pPr>
+        <w:keepNext w:val="false"/>
+        <w:spacing w:after="120"/>
+      </w:pPr>
+      <w:r>
+        <w:t xml:space="preserve">The </w:t>
+      </w:r>
+      <w:r>
+        <w:rPr>
+          <w:b/>
+          <w:bCs/>
+        </w:rPr>
+        <w:t xml:space="preserve">Suggestions</w:t>
+      </w:r>
+      <w:r>
+        <w:t xml:space="preserve"> tab:</w:t>
       </w:r>
     </w:p>
     <w:p>
@@ -2283,7 +2372,7 @@
         <w:spacing w:after="60"/>
       </w:pPr>
       <w:r>
-        <w:t xml:space="preserve">It opens on this morning’s suggestions (</w:t>
+        <w:t xml:space="preserve">It starts with this morning’s suggestions (</w:t>
       </w:r>
       <w:r>
         <w:rPr>
@@ -2613,7 +2702,7 @@
         <w:t xml:space="preserve">Transfer orders</w:t>
       </w:r>
       <w:r>
-        <w:t xml:space="preserve"> tab lists every saved transfer, newest first: From, To, status, lines, value at the sending branch’s cost, export count and who saved it when. Filter by From, To and status. A Draft more than a week old shows </w:t>
+        <w:t xml:space="preserve"> tab, where the page opens, lists every saved transfer, newest first: From, To, status, lines, value at the sending branch’s cost, export count and who saved it when. Filter by From, To and status. A Draft more than a week old shows </w:t>
       </w:r>
       <w:r>
         <w:rPr>
@@ -2624,6 +2713,55 @@
       </w:r>
       <w:r>
         <w:t xml:space="preserve">, and the tab label counts them, so nothing is forgotten.</w:t>
+      </w:r>
+    </w:p>
+    <w:p>
+      <w:pPr>
+        <w:keepNext w:val="false"/>
+        <w:spacing w:after="120"/>
+      </w:pPr>
+      <w:r>
+        <w:t xml:space="preserve">Each status is a coloured pill: </w:t>
+      </w:r>
+      <w:r>
+        <w:rPr>
+          <w:b/>
+          <w:bCs/>
+        </w:rPr>
+        <w:t xml:space="preserve">Draft</w:t>
+      </w:r>
+      <w:r>
+        <w:t xml:space="preserve"> amber, </w:t>
+      </w:r>
+      <w:r>
+        <w:rPr>
+          <w:b/>
+          <w:bCs/>
+        </w:rPr>
+        <w:t xml:space="preserve">Exported</w:t>
+      </w:r>
+      <w:r>
+        <w:t xml:space="preserve"> blue, </w:t>
+      </w:r>
+      <w:r>
+        <w:rPr>
+          <w:b/>
+          <w:bCs/>
+        </w:rPr>
+        <w:t xml:space="preserve">Entered in Equip</w:t>
+      </w:r>
+      <w:r>
+        <w:t xml:space="preserve"> green, </w:t>
+      </w:r>
+      <w:r>
+        <w:rPr>
+          <w:b/>
+          <w:bCs/>
+        </w:rPr>
+        <w:t xml:space="preserve">Cancelled</w:t>
+      </w:r>
+      <w:r>
+        <w:t xml:space="preserve"> grey.</w:t>
       </w:r>
     </w:p>
     <w:p>
@@ -8020,7 +8158,7 @@
         <w:sz w:val="16"/>
         <w:szCs w:val="16"/>
       </w:rPr>
-      <w:t xml:space="preserve">Non-JD Parts Order Tool: user guide (version 0.6.0)   ·   Page </w:t>
+      <w:t xml:space="preserve">Non-JD Parts Order Tool: user guide (version 0.6.2)   ·   Page </w:t>
     </w:r>
     <w:r>
       <w:rPr>

</xml_diff>

<commit_message>
SPI Parts Hub 0.8.0 docs: walkthrough and guide, F2 done, Plan H/G and round 2 complete
Co-Authored-By: Claude Opus 5.5 <noreply@anthropic.com>
</commit_message>
<xml_diff>
--- a/projects/part order tool - app/for-users/Non-JD Order Tool - User Guide.docx
+++ b/projects/part order tool - app/for-users/Non-JD Order Tool - User Guide.docx
@@ -7,7 +7,7 @@
         <w:pStyle w:val="Title"/>
       </w:pPr>
       <w:r>
-        <w:t xml:space="preserve">Non-JD Parts Order Tool: user guide</w:t>
+        <w:t xml:space="preserve">SPI Parts Hub: user guide</w:t>
       </w:r>
     </w:p>
     <w:p>
@@ -21,7 +21,7 @@
         <w:rPr>
           <w:color w:val="595959"/>
         </w:rPr>
-        <w:t xml:space="preserve">For Ben, Shannon, Barry and Curt · Version 0.7.0 · October 29, 2026 (test version) · https://10.110.100.13:8443</w:t>
+        <w:t xml:space="preserve">Formerly the Non-JD Parts Order Tool · For Ben, Shannon, Barry and Curt · Version 0.8.0 · October 30, 2026 (test version) · https://10.110.100.13:8443</w:t>
       </w:r>
     </w:p>
     <w:p>
@@ -34,10 +34,60 @@
           <w:b/>
           <w:bCs/>
         </w:rPr>
-        <w:t xml:space="preserve">In one sentence:</w:t>
-      </w:r>
-      <w:r>
-        <w:t xml:space="preserve"> the tool shows each branch which non-John Deere parts to reorder and why, suggests stock other branches could send instead, lets you tune the rules behind those suggestions, and turns the parts you pick into an order file for each vendor.</w:t>
+        <w:t xml:space="preserve">SPI Parts Hub</w:t>
+      </w:r>
+      <w:r>
+        <w:t xml:space="preserve"> (until 0.8.0 the Non-JD Parts Order Tool) opens on a launch page where you pick what to work on: </w:t>
+      </w:r>
+      <w:r>
+        <w:rPr>
+          <w:b/>
+          <w:bCs/>
+        </w:rPr>
+        <w:t xml:space="preserve">Non-JD ordering</w:t>
+      </w:r>
+      <w:r>
+        <w:t xml:space="preserve">, </w:t>
+      </w:r>
+      <w:r>
+        <w:rPr>
+          <w:b/>
+          <w:bCs/>
+        </w:rPr>
+        <w:t xml:space="preserve">Cleanup</w:t>
+      </w:r>
+      <w:r>
+        <w:t xml:space="preserve"> or </w:t>
+      </w:r>
+      <w:r>
+        <w:rPr>
+          <w:b/>
+          <w:bCs/>
+        </w:rPr>
+        <w:t xml:space="preserve">Part Lookup</w:t>
+      </w:r>
+      <w:r>
+        <w:t xml:space="preserve"> today, with </w:t>
+      </w:r>
+      <w:r>
+        <w:rPr>
+          <w:b/>
+          <w:bCs/>
+        </w:rPr>
+        <w:t xml:space="preserve">JD ordering</w:t>
+      </w:r>
+      <w:r>
+        <w:t xml:space="preserve"> and </w:t>
+      </w:r>
+      <w:r>
+        <w:rPr>
+          <w:b/>
+          <w:bCs/>
+        </w:rPr>
+        <w:t xml:space="preserve">Inventory management</w:t>
+      </w:r>
+      <w:r>
+        <w:t xml:space="preserve"> to come. Most of this guide is about Non-JD ordering.</w:t>
       </w:r>
     </w:p>
     <w:p>
@@ -46,134 +96,14 @@
         <w:spacing w:after="120"/>
       </w:pPr>
       <w:r>
-        <w:t xml:space="preserve">This guide covers getting in, what each page does, and exactly how every number is worked out. Version 0.7.0 includes Ben’s round 1 answers, several branches and dealer groups at once, </w:t>
-      </w:r>
-      <w:r>
-        <w:rPr>
-          <w:b/>
-          <w:bCs/>
-        </w:rPr>
-        <w:t xml:space="preserve">phase-in</w:t>
-      </w:r>
-      <w:r>
-        <w:t xml:space="preserve">, </w:t>
-      </w:r>
-      <w:r>
-        <w:rPr>
-          <w:b/>
-          <w:bCs/>
-        </w:rPr>
-        <w:t xml:space="preserve">transfer suggestions</w:t>
-      </w:r>
-      <w:r>
-        <w:t xml:space="preserve"> and </w:t>
-      </w:r>
-      <w:r>
-        <w:rPr>
-          <w:b/>
-          <w:bCs/>
-        </w:rPr>
-        <w:t xml:space="preserve">saving transfers</w:t>
-      </w:r>
-      <w:r>
-        <w:t xml:space="preserve"> in the app, with transfer orders and transfer rules, and </w:t>
-      </w:r>
-      <w:r>
-        <w:rPr>
-          <w:b/>
-          <w:bCs/>
-        </w:rPr>
-        <w:t xml:space="preserve">transfers on One-Time Orders</w:t>
-      </w:r>
-      <w:r>
-        <w:t xml:space="preserve"> (round 2, from Ben’s answers of October 27). What changed in each version is in the </w:t>
-      </w:r>
-      <w:r>
-        <w:rPr>
-          <w:b/>
-          <w:bCs/>
-        </w:rPr>
-        <w:t xml:space="preserve">walkthrough</w:t>
-      </w:r>
-      <w:r>
-        <w:t xml:space="preserve">, Part 2.</w:t>
-      </w:r>
-    </w:p>
-    <w:p>
-      <w:pPr>
-        <w:pStyle w:val="Heading1"/>
-      </w:pPr>
-      <w:r>
-        <w:t xml:space="preserve">1. Getting started</w:t>
-      </w:r>
-    </w:p>
-    <w:p>
-      <w:pPr>
-        <w:pStyle w:val="ListParagraph"/>
-        <w:numPr>
-          <w:ilvl w:val="0"/>
-          <w:numId w:val="2"/>
-        </w:numPr>
-        <w:spacing w:after="60"/>
-      </w:pPr>
-      <w:r>
-        <w:t xml:space="preserve">Open </w:t>
-      </w:r>
-      <w:r>
-        <w:rPr>
-          <w:b/>
-          <w:bCs/>
-        </w:rPr>
-        <w:t xml:space="preserve">https://10.110.100.13:8443</w:t>
-      </w:r>
-      <w:r>
-        <w:t xml:space="preserve"> in Edge or Chrome on your PC.</w:t>
-      </w:r>
-    </w:p>
-    <w:p>
-      <w:pPr>
-        <w:pStyle w:val="ListParagraph"/>
-        <w:numPr>
-          <w:ilvl w:val="0"/>
-          <w:numId w:val="2"/>
-        </w:numPr>
-        <w:spacing w:after="60"/>
-      </w:pPr>
-      <w:r>
-        <w:t xml:space="preserve">The first time, the browser warns "Your connection isn’t private". This test server uses its own certificate. Click </w:t>
-      </w:r>
-      <w:r>
-        <w:rPr>
-          <w:b/>
-          <w:bCs/>
-        </w:rPr>
-        <w:t xml:space="preserve">Advanced</w:t>
-      </w:r>
-      <w:r>
-        <w:t xml:space="preserve">, then </w:t>
-      </w:r>
-      <w:r>
-        <w:rPr>
-          <w:b/>
-          <w:bCs/>
-        </w:rPr>
-        <w:t xml:space="preserve">Continue to 10.110.100.13</w:t>
-      </w:r>
-      <w:r>
-        <w:t xml:space="preserve">. You only need to do this once.</w:t>
-      </w:r>
-    </w:p>
-    <w:p>
-      <w:pPr>
-        <w:pStyle w:val="ListParagraph"/>
-        <w:numPr>
-          <w:ilvl w:val="0"/>
-          <w:numId w:val="2"/>
-        </w:numPr>
-        <w:spacing w:after="60"/>
-      </w:pPr>
-      <w:r>
-        <w:t xml:space="preserve">Sign in with your normal Microsoft (work) account. Only Ben, Shannon, Barry, Curt and Brian have access during the test.</w:t>
+        <w:rPr>
+          <w:b/>
+          <w:bCs/>
+        </w:rPr>
+        <w:t xml:space="preserve">In one sentence:</w:t>
+      </w:r>
+      <w:r>
+        <w:t xml:space="preserve"> Non-JD ordering shows each branch which non-John Deere parts to reorder and why, suggests stock other branches could send instead, lets you tune the rules behind those suggestions, and turns the parts you pick into an order file for each vendor.</w:t>
       </w:r>
     </w:p>
     <w:p>
@@ -182,25 +112,144 @@
         <w:spacing w:after="120"/>
       </w:pPr>
       <w:r>
-        <w:t xml:space="preserve">Sign-in is shared by all your tabs and normally lasts until you close the browser. The sign-out button is next to your name at the bottom left. The version number is under </w:t>
-      </w:r>
-      <w:r>
-        <w:rPr>
-          <w:b/>
-          <w:bCs/>
-        </w:rPr>
-        <w:t xml:space="preserve">App Settings → About</w:t>
-      </w:r>
-      <w:r>
-        <w:t xml:space="preserve">.</w:t>
-      </w:r>
-    </w:p>
-    <w:p>
-      <w:pPr>
-        <w:pStyle w:val="Heading3"/>
-      </w:pPr>
-      <w:r>
-        <w:t xml:space="preserve">How fresh is the data?</w:t>
+        <w:t xml:space="preserve">This guide covers getting in, what each page does, and exactly how every number is worked out. Version 0.8.0 includes Ben’s round 1 answers, several branches and dealer groups at once, </w:t>
+      </w:r>
+      <w:r>
+        <w:rPr>
+          <w:b/>
+          <w:bCs/>
+        </w:rPr>
+        <w:t xml:space="preserve">phase-in</w:t>
+      </w:r>
+      <w:r>
+        <w:t xml:space="preserve">, </w:t>
+      </w:r>
+      <w:r>
+        <w:rPr>
+          <w:b/>
+          <w:bCs/>
+        </w:rPr>
+        <w:t xml:space="preserve">transfer suggestions</w:t>
+      </w:r>
+      <w:r>
+        <w:t xml:space="preserve"> and </w:t>
+      </w:r>
+      <w:r>
+        <w:rPr>
+          <w:b/>
+          <w:bCs/>
+        </w:rPr>
+        <w:t xml:space="preserve">saving transfers</w:t>
+      </w:r>
+      <w:r>
+        <w:t xml:space="preserve"> in the app, with transfer orders and transfer rules, and </w:t>
+      </w:r>
+      <w:r>
+        <w:rPr>
+          <w:b/>
+          <w:bCs/>
+        </w:rPr>
+        <w:t xml:space="preserve">transfers on One-Time Orders</w:t>
+      </w:r>
+      <w:r>
+        <w:t xml:space="preserve"> (round 2, from Ben’s answers of October 27), and the </w:t>
+      </w:r>
+      <w:r>
+        <w:rPr>
+          <w:b/>
+          <w:bCs/>
+        </w:rPr>
+        <w:t xml:space="preserve">launch page</w:t>
+      </w:r>
+      <w:r>
+        <w:t xml:space="preserve"> in front of it all (0.8.0). What changed in each version is in the </w:t>
+      </w:r>
+      <w:r>
+        <w:rPr>
+          <w:b/>
+          <w:bCs/>
+        </w:rPr>
+        <w:t xml:space="preserve">walkthrough</w:t>
+      </w:r>
+      <w:r>
+        <w:t xml:space="preserve">, Part 2.</w:t>
+      </w:r>
+    </w:p>
+    <w:p>
+      <w:pPr>
+        <w:pStyle w:val="Heading1"/>
+      </w:pPr>
+      <w:r>
+        <w:t xml:space="preserve">1. Getting started</w:t>
+      </w:r>
+    </w:p>
+    <w:p>
+      <w:pPr>
+        <w:pStyle w:val="ListParagraph"/>
+        <w:numPr>
+          <w:ilvl w:val="0"/>
+          <w:numId w:val="2"/>
+        </w:numPr>
+        <w:spacing w:after="60"/>
+      </w:pPr>
+      <w:r>
+        <w:t xml:space="preserve">Open </w:t>
+      </w:r>
+      <w:r>
+        <w:rPr>
+          <w:b/>
+          <w:bCs/>
+        </w:rPr>
+        <w:t xml:space="preserve">https://10.110.100.13:8443</w:t>
+      </w:r>
+      <w:r>
+        <w:t xml:space="preserve"> in Edge or Chrome on your PC.</w:t>
+      </w:r>
+    </w:p>
+    <w:p>
+      <w:pPr>
+        <w:pStyle w:val="ListParagraph"/>
+        <w:numPr>
+          <w:ilvl w:val="0"/>
+          <w:numId w:val="2"/>
+        </w:numPr>
+        <w:spacing w:after="60"/>
+      </w:pPr>
+      <w:r>
+        <w:t xml:space="preserve">The first time, the browser warns "Your connection isn’t private". This test server uses its own certificate. Click </w:t>
+      </w:r>
+      <w:r>
+        <w:rPr>
+          <w:b/>
+          <w:bCs/>
+        </w:rPr>
+        <w:t xml:space="preserve">Advanced</w:t>
+      </w:r>
+      <w:r>
+        <w:t xml:space="preserve">, then </w:t>
+      </w:r>
+      <w:r>
+        <w:rPr>
+          <w:b/>
+          <w:bCs/>
+        </w:rPr>
+        <w:t xml:space="preserve">Continue to 10.110.100.13</w:t>
+      </w:r>
+      <w:r>
+        <w:t xml:space="preserve">. You only need to do this once.</w:t>
+      </w:r>
+    </w:p>
+    <w:p>
+      <w:pPr>
+        <w:pStyle w:val="ListParagraph"/>
+        <w:numPr>
+          <w:ilvl w:val="0"/>
+          <w:numId w:val="2"/>
+        </w:numPr>
+        <w:spacing w:after="60"/>
+      </w:pPr>
+      <w:r>
+        <w:t xml:space="preserve">Sign in with your normal Microsoft (work) account. Only Ben, Shannon, Barry, Curt and Brian have access during the test.</w:t>
       </w:r>
     </w:p>
     <w:p>
@@ -209,17 +258,25 @@
         <w:spacing w:after="120"/>
       </w:pPr>
       <w:r>
-        <w:t xml:space="preserve">The tool works from a snapshot of Equip taken in the morning: stock, sales history, open purchase orders and transfers. The date at the top right of every page says when it was taken. It turns </w:t>
-      </w:r>
-      <w:r>
-        <w:rPr>
-          <w:b/>
-          <w:bCs/>
-        </w:rPr>
-        <w:t xml:space="preserve">amber</w:t>
-      </w:r>
-      <w:r>
-        <w:t xml:space="preserve"> when the data is more than one business day old. During this test the snapshot may be refreshed less often than daily, so check the date.</w:t>
+        <w:t xml:space="preserve">Sign-in is shared by all your tabs and normally lasts until you close the browser. The sign-out button is next to your name at the bottom left. The version number is under </w:t>
+      </w:r>
+      <w:r>
+        <w:rPr>
+          <w:b/>
+          <w:bCs/>
+        </w:rPr>
+        <w:t xml:space="preserve">App Settings → About</w:t>
+      </w:r>
+      <w:r>
+        <w:t xml:space="preserve">.</w:t>
+      </w:r>
+    </w:p>
+    <w:p>
+      <w:pPr>
+        <w:pStyle w:val="Heading3"/>
+      </w:pPr>
+      <w:r>
+        <w:t xml:space="preserve">How fresh is the data?</w:t>
       </w:r>
     </w:p>
     <w:p>
@@ -228,27 +285,17 @@
         <w:spacing w:after="120"/>
       </w:pPr>
       <w:r>
-        <w:t xml:space="preserve">Your </w:t>
-      </w:r>
-      <w:r>
-        <w:rPr>
-          <w:b/>
-          <w:bCs/>
-        </w:rPr>
-        <w:t xml:space="preserve">rule</w:t>
-      </w:r>
-      <w:r>
-        <w:t xml:space="preserve"> and </w:t>
-      </w:r>
-      <w:r>
-        <w:rPr>
-          <w:b/>
-          <w:bCs/>
-        </w:rPr>
-        <w:t xml:space="preserve">part setting</w:t>
-      </w:r>
-      <w:r>
-        <w:t xml:space="preserve"> changes are different: they apply in the tool immediately, for everyone. The morning snapshot picks them up the next day.</w:t>
+        <w:t xml:space="preserve">The tool works from a snapshot of Equip taken in the morning: stock, sales history, open purchase orders and transfers. The date at the top right of every page says when it was taken. It turns </w:t>
+      </w:r>
+      <w:r>
+        <w:rPr>
+          <w:b/>
+          <w:bCs/>
+        </w:rPr>
+        <w:t xml:space="preserve">amber</w:t>
+      </w:r>
+      <w:r>
+        <w:t xml:space="preserve"> when the data is more than one business day old. During this test the snapshot may be refreshed less often than daily, so check the date.</w:t>
       </w:r>
     </w:p>
     <w:p>
@@ -257,25 +304,27 @@
         <w:spacing w:after="120"/>
       </w:pPr>
       <w:r>
-        <w:t xml:space="preserve">Branches </w:t>
-      </w:r>
-      <w:r>
-        <w:rPr>
-          <w:b/>
-          <w:bCs/>
-        </w:rPr>
-        <w:t xml:space="preserve">12, 5, 97, 4B and 93C</w:t>
-      </w:r>
-      <w:r>
-        <w:t xml:space="preserve"> are left out of the tool, as Ben asked.</w:t>
-      </w:r>
-    </w:p>
-    <w:p>
-      <w:pPr>
-        <w:pStyle w:val="Heading1"/>
-      </w:pPr>
-      <w:r>
-        <w:t xml:space="preserve">2. The pages</w:t>
+        <w:t xml:space="preserve">Your </w:t>
+      </w:r>
+      <w:r>
+        <w:rPr>
+          <w:b/>
+          <w:bCs/>
+        </w:rPr>
+        <w:t xml:space="preserve">rule</w:t>
+      </w:r>
+      <w:r>
+        <w:t xml:space="preserve"> and </w:t>
+      </w:r>
+      <w:r>
+        <w:rPr>
+          <w:b/>
+          <w:bCs/>
+        </w:rPr>
+        <w:t xml:space="preserve">part setting</w:t>
+      </w:r>
+      <w:r>
+        <w:t xml:space="preserve"> changes are different: they apply in the tool immediately, for everyone. The morning snapshot picks them up the next day.</w:t>
       </w:r>
     </w:p>
     <w:p>
@@ -284,7 +333,25 @@
         <w:spacing w:after="120"/>
       </w:pPr>
       <w:r>
-        <w:t xml:space="preserve">The menu on the left takes you to each page. The branch you’re looking at shows at the top right.</w:t>
+        <w:t xml:space="preserve">Branches </w:t>
+      </w:r>
+      <w:r>
+        <w:rPr>
+          <w:b/>
+          <w:bCs/>
+        </w:rPr>
+        <w:t xml:space="preserve">12, 5, 97, 4B and 93C</w:t>
+      </w:r>
+      <w:r>
+        <w:t xml:space="preserve"> are left out of the tool, as Ben asked.</w:t>
+      </w:r>
+    </w:p>
+    <w:p>
+      <w:pPr>
+        <w:pStyle w:val="Heading1"/>
+      </w:pPr>
+      <w:r>
+        <w:t xml:space="preserve">2. The pages</w:t>
       </w:r>
     </w:p>
     <w:p>
@@ -292,7 +359,7 @@
         <w:pStyle w:val="Heading2"/>
       </w:pPr>
       <w:r>
-        <w:t xml:space="preserve">Home</w:t>
+        <w:t xml:space="preserve">The launch page and areas (0.8.0)</w:t>
       </w:r>
     </w:p>
     <w:p>
@@ -301,7 +368,251 @@
         <w:spacing w:after="120"/>
       </w:pPr>
       <w:r>
-        <w:t xml:space="preserve">Shows how many parts need ordering at your branch and what they would cost, with a </w:t>
+        <w:t xml:space="preserve">The app opens on the </w:t>
+      </w:r>
+      <w:r>
+        <w:rPr>
+          <w:b/>
+          <w:bCs/>
+        </w:rPr>
+        <w:t xml:space="preserve">launch page</w:t>
+      </w:r>
+      <w:r>
+        <w:t xml:space="preserve">: the SPI logo, a greeting, a </w:t>
+      </w:r>
+      <w:r>
+        <w:rPr>
+          <w:b/>
+          <w:bCs/>
+        </w:rPr>
+        <w:t xml:space="preserve">Branch</w:t>
+      </w:r>
+      <w:r>
+        <w:t xml:space="preserve"> select (your App Settings default to start with) and the date of the morning data. Under it is a card for each area. The cards say what is waiting at the picked branch:</w:t>
+      </w:r>
+    </w:p>
+    <w:p>
+      <w:pPr>
+        <w:pStyle w:val="ListParagraph"/>
+        <w:numPr>
+          <w:ilvl w:val="0"/>
+          <w:numId w:val="3"/>
+        </w:numPr>
+        <w:spacing w:after="60"/>
+      </w:pPr>
+      <w:r>
+        <w:rPr>
+          <w:b/>
+          <w:bCs/>
+        </w:rPr>
+        <w:t xml:space="preserve">Non-JD ordering:</w:t>
+      </w:r>
+      <w:r>
+        <w:t xml:space="preserve"> reorder, One-Time Orders, transfers and rules. It shows the same figures as its Home page, for example “220 parts to order · $93,000” and, in purple, “67 could come by transfer”.</w:t>
+      </w:r>
+    </w:p>
+    <w:p>
+      <w:pPr>
+        <w:pStyle w:val="ListParagraph"/>
+        <w:numPr>
+          <w:ilvl w:val="0"/>
+          <w:numId w:val="3"/>
+        </w:numPr>
+        <w:spacing w:after="60"/>
+      </w:pPr>
+      <w:r>
+        <w:rPr>
+          <w:b/>
+          <w:bCs/>
+        </w:rPr>
+        <w:t xml:space="preserve">Cleanup:</w:t>
+      </w:r>
+      <w:r>
+        <w:t xml:space="preserve"> things to fix in Equip, for example “21 minimums with no demand at Branch 1” (the same count as Cleanup filtered to that branch).</w:t>
+      </w:r>
+    </w:p>
+    <w:p>
+      <w:pPr>
+        <w:pStyle w:val="ListParagraph"/>
+        <w:numPr>
+          <w:ilvl w:val="0"/>
+          <w:numId w:val="3"/>
+        </w:numPr>
+        <w:spacing w:after="60"/>
+      </w:pPr>
+      <w:r>
+        <w:rPr>
+          <w:b/>
+          <w:bCs/>
+        </w:rPr>
+        <w:t xml:space="preserve">Part Lookup:</w:t>
+      </w:r>
+      <w:r>
+        <w:t xml:space="preserve"> any part’s stock, prices, history and settings.</w:t>
+      </w:r>
+    </w:p>
+    <w:p>
+      <w:pPr>
+        <w:pStyle w:val="ListParagraph"/>
+        <w:numPr>
+          <w:ilvl w:val="0"/>
+          <w:numId w:val="3"/>
+        </w:numPr>
+        <w:spacing w:after="60"/>
+      </w:pPr>
+      <w:r>
+        <w:rPr>
+          <w:b/>
+          <w:bCs/>
+        </w:rPr>
+        <w:t xml:space="preserve">JD ordering</w:t>
+      </w:r>
+      <w:r>
+        <w:t xml:space="preserve"> and </w:t>
+      </w:r>
+      <w:r>
+        <w:rPr>
+          <w:b/>
+          <w:bCs/>
+        </w:rPr>
+        <w:t xml:space="preserve">Inventory management</w:t>
+      </w:r>
+      <w:r>
+        <w:t xml:space="preserve"> are greyed out with </w:t>
+      </w:r>
+      <w:r>
+        <w:rPr>
+          <w:b/>
+          <w:bCs/>
+        </w:rPr>
+        <w:t xml:space="preserve">Coming later</w:t>
+      </w:r>
+      <w:r>
+        <w:t xml:space="preserve">: they show where the tool is heading and can’t be opened yet.</w:t>
+      </w:r>
+    </w:p>
+    <w:p>
+      <w:pPr>
+        <w:keepNext w:val="false"/>
+        <w:spacing w:after="120"/>
+      </w:pPr>
+      <w:r>
+        <w:t xml:space="preserve">A count is left out when it is 0, while the data loads, or when the data can’t be read; the cards still work. Under the cards, </w:t>
+      </w:r>
+      <w:r>
+        <w:rPr>
+          <w:b/>
+          <w:bCs/>
+        </w:rPr>
+        <w:t xml:space="preserve">Other parts tools</w:t>
+      </w:r>
+      <w:r>
+        <w:t xml:space="preserve"> links open </w:t>
+      </w:r>
+      <w:r>
+        <w:rPr>
+          <w:b/>
+          <w:bCs/>
+        </w:rPr>
+        <w:t xml:space="preserve">Parts Availability</w:t>
+      </w:r>
+      <w:r>
+        <w:t xml:space="preserve"> and the </w:t>
+      </w:r>
+      <w:r>
+        <w:rPr>
+          <w:b/>
+          <w:bCs/>
+        </w:rPr>
+        <w:t xml:space="preserve">Parts reports</w:t>
+      </w:r>
+      <w:r>
+        <w:t xml:space="preserve"> app in a new tab, next to </w:t>
+      </w:r>
+      <w:r>
+        <w:rPr>
+          <w:b/>
+          <w:bCs/>
+        </w:rPr>
+        <w:t xml:space="preserve">App Settings</w:t>
+      </w:r>
+      <w:r>
+        <w:t xml:space="preserve">.</w:t>
+      </w:r>
+    </w:p>
+    <w:p>
+      <w:pPr>
+        <w:keepNext w:val="false"/>
+        <w:spacing w:after="120"/>
+      </w:pPr>
+      <w:r>
+        <w:t xml:space="preserve">Inside an area, the </w:t>
+      </w:r>
+      <w:r>
+        <w:rPr>
+          <w:b/>
+          <w:bCs/>
+        </w:rPr>
+        <w:t xml:space="preserve">menu on the left</w:t>
+      </w:r>
+      <w:r>
+        <w:t xml:space="preserve"> shows only that area’s pages. At the top are </w:t>
+      </w:r>
+      <w:r>
+        <w:rPr>
+          <w:b/>
+          <w:bCs/>
+        </w:rPr>
+        <w:t xml:space="preserve">‹ All areas</w:t>
+      </w:r>
+      <w:r>
+        <w:t xml:space="preserve"> (back to the launch page) and the </w:t>
+      </w:r>
+      <w:r>
+        <w:rPr>
+          <w:b/>
+          <w:bCs/>
+        </w:rPr>
+        <w:t xml:space="preserve">Area</w:t>
+      </w:r>
+      <w:r>
+        <w:t xml:space="preserve"> select, which opens another area. If leaving would lose ticked parts or unsaved transfers, the app asks first. The breadcrumb at the top starts with the area, for example “Non-JD ordering › Recommended Reorder”. App Settings stays at the bottom of the menu. The branch you’re looking at shows at the top right.</w:t>
+      </w:r>
+    </w:p>
+    <w:p>
+      <w:pPr>
+        <w:keepNext w:val="false"/>
+        <w:spacing w:after="120"/>
+      </w:pPr>
+      <w:r>
+        <w:t xml:space="preserve">Every address from before 0.8.0 still opens the same page, so bookmarks keep working. The only change: the bare address is now the launch page, and Non-JD ordering’s Home is at </w:t>
+      </w:r>
+      <w:r>
+        <w:rPr>
+          <w:b/>
+          <w:bCs/>
+        </w:rPr>
+        <w:t xml:space="preserve">/non-jd</w:t>
+      </w:r>
+      <w:r>
+        <w:t xml:space="preserve">.</w:t>
+      </w:r>
+    </w:p>
+    <w:p>
+      <w:pPr>
+        <w:pStyle w:val="Heading2"/>
+      </w:pPr>
+      <w:r>
+        <w:t xml:space="preserve">Home (Non-JD ordering)</w:t>
+      </w:r>
+    </w:p>
+    <w:p>
+      <w:pPr>
+        <w:keepNext w:val="false"/>
+        <w:spacing w:after="120"/>
+      </w:pPr>
+      <w:r>
+        <w:t xml:space="preserve">The first page of Non-JD ordering (/non-jd). Shows how many parts need ordering at your branch and what they would cost, with a </w:t>
       </w:r>
       <w:r>
         <w:rPr>
@@ -4174,7 +4485,7 @@
         <w:spacing w:after="120"/>
       </w:pPr>
       <w:r>
-        <w:t xml:space="preserve">Equip minimums on parts with </w:t>
+        <w:t xml:space="preserve">Its own area: open it from the launch page or the Area select. Equip minimums on parts with </w:t>
       </w:r>
       <w:r>
         <w:rPr>
@@ -4221,7 +4532,7 @@
         <w:spacing w:after="120"/>
       </w:pPr>
       <w:r>
-        <w:t xml:space="preserve">Your own default branch and franchise (saved in your browser only). Reorder, One-Time Order and Part Lookup open on them. </w:t>
+        <w:t xml:space="preserve">Your own default branch and franchise (saved in your browser only). The launch page, Reorder, One-Time Order and Part Lookup open on them. Open it from the bottom of the left menu or from the launch page. </w:t>
       </w:r>
       <w:r>
         <w:rPr>
@@ -8556,7 +8867,7 @@
         <w:sz w:val="16"/>
         <w:szCs w:val="16"/>
       </w:rPr>
-      <w:t xml:space="preserve">Non-JD Parts Order Tool: user guide (version 0.7.0)   ·   Page </w:t>
+      <w:t xml:space="preserve">SPI Parts Hub: user guide (version 0.8.0)   ·   Page </w:t>
     </w:r>
     <w:r>
       <w:rPr>

</xml_diff>